<commit_message>
Add paper push for 2026-06-05
</commit_message>
<xml_diff>
--- a/files/paper-push/daily_paper_push_2026-06-05.docx
+++ b/files/paper-push/daily_paper_push_2026-06-05.docx
@@ -42,7 +42,7 @@
         <w:rPr>
           <w:rFonts w:ascii="Microsoft YaHei" w:hAnsi="Microsoft YaHei" w:eastAsia="Microsoft YaHei"/>
         </w:rPr>
-        <w:t>历史去重后今日新增 1 篇。排序规则：Nature 系列、Science 系列、其余重点期刊按影响力和主题相关性排序。</w:t>
+        <w:t>历史去重后今日新增 16 篇。排序规则：Nature 系列、Science 系列、其余重点期刊按影响力和主题相关性排序。</w:t>
       </w:r>
     </w:p>
     <w:p>
@@ -70,7 +70,7 @@
           <w:rFonts w:ascii="Microsoft YaHei" w:hAnsi="Microsoft YaHei" w:eastAsia="Microsoft YaHei"/>
           <w:b/>
         </w:rPr>
-        <w:t>1. Trace Metal Biogeochemistry in the Nordic Seas: Arctic and Atlantic Water Inflows Determine (Micro)Nutrient Availability</w:t>
+        <w:t>1. Global Eddy Subduction Carbon Pump From Argo Floats</w:t>
       </w:r>
     </w:p>
     <w:p>
@@ -80,7 +80,7 @@
           <w:color w:val="55697D"/>
           <w:sz w:val="18"/>
         </w:rPr>
-        <w:t>作者：Yaqing Ruan; Stephan Krisch; Thomas J. Browning; C. Mark Moore; Mario Esposito; Tim Steffens; Eric P. Achterberg</w:t>
+        <w:t>作者：Maxime Keutgen De Greef; Laure Resplandy; Mathieu A. Poupon</w:t>
       </w:r>
     </w:p>
     <w:p>
@@ -100,6 +100,246 @@
           <w:color w:val="55697D"/>
           <w:sz w:val="18"/>
         </w:rPr>
+        <w:t>发表月份：2026-03</w:t>
+      </w:r>
+    </w:p>
+    <w:p>
+      <w:r>
+        <w:rPr>
+          <w:rFonts w:ascii="Microsoft YaHei" w:hAnsi="Microsoft YaHei" w:eastAsia="Microsoft YaHei"/>
+          <w:color w:val="55697D"/>
+          <w:sz w:val="18"/>
+        </w:rPr>
+        <w:t>DOI：10.1029/2025gb008912</w:t>
+      </w:r>
+    </w:p>
+    <w:p>
+      <w:r>
+        <w:rPr>
+          <w:rFonts w:ascii="Microsoft YaHei" w:hAnsi="Microsoft YaHei" w:eastAsia="Microsoft YaHei"/>
+          <w:b/>
+          <w:sz w:val="19"/>
+        </w:rPr>
+        <w:t>关键词：BGC-Argo; carbon pump; backscattering; bio-optics; microbial carbon</w:t>
+      </w:r>
+    </w:p>
+    <w:p>
+      <w:r>
+        <w:rPr>
+          <w:rFonts w:ascii="Microsoft YaHei" w:hAnsi="Microsoft YaHei" w:eastAsia="Microsoft YaHei"/>
+        </w:rPr>
+        <w:t>这项研究关注BGC-Argo 剖面约束的生物地球化学变化。 数据基础是 BGC-Argo 浮标剖面及相关生物地球化学观测，可用于连接垂向结构和过程变化。 研究主要分析变化趋势、事件响应、驱动机制或方法表现，并把观测结果与生态和生物地球化学过程联系起来。 核心结果或实现为该主题提供了新的观测约束、方法基准或过程解释。 它有助于解释观测现象、比较方法差异，并为后续海洋生物地球化学分析提供线索。</w:t>
+      </w:r>
+    </w:p>
+    <w:p>
+      <w:r>
+        <w:rPr>
+          <w:rFonts w:ascii="Microsoft YaHei" w:hAnsi="Microsoft YaHei" w:eastAsia="Microsoft YaHei"/>
+          <w:color w:val="0563C1"/>
+          <w:sz w:val="18"/>
+        </w:rPr>
+        <w:t>链接：https://doi.org/10.1029/2025gb008912</w:t>
+      </w:r>
+    </w:p>
+    <w:p>
+      <w:pPr>
+        <w:pStyle w:val="Heading3"/>
+      </w:pPr>
+      <w:r>
+        <w:rPr>
+          <w:rFonts w:ascii="Microsoft YaHei" w:hAnsi="Microsoft YaHei" w:eastAsia="Microsoft YaHei"/>
+          <w:b/>
+        </w:rPr>
+        <w:t>2. Delineating Marine Planktonic Habitats Through the Biogeochemical‐Argo Array Data</w:t>
+      </w:r>
+    </w:p>
+    <w:p>
+      <w:r>
+        <w:rPr>
+          <w:rFonts w:ascii="Microsoft YaHei" w:hAnsi="Microsoft YaHei" w:eastAsia="Microsoft YaHei"/>
+          <w:color w:val="55697D"/>
+          <w:sz w:val="18"/>
+        </w:rPr>
+        <w:t>作者：Anh H. Pham; Ajit Subramaniam; Joseph P. Montoya</w:t>
+      </w:r>
+    </w:p>
+    <w:p>
+      <w:r>
+        <w:rPr>
+          <w:rFonts w:ascii="Microsoft YaHei" w:hAnsi="Microsoft YaHei" w:eastAsia="Microsoft YaHei"/>
+          <w:color w:val="55697D"/>
+          <w:sz w:val="18"/>
+        </w:rPr>
+        <w:t>期刊：Journal of Geophysical Research: Oceans</w:t>
+      </w:r>
+    </w:p>
+    <w:p>
+      <w:r>
+        <w:rPr>
+          <w:rFonts w:ascii="Microsoft YaHei" w:hAnsi="Microsoft YaHei" w:eastAsia="Microsoft YaHei"/>
+          <w:color w:val="55697D"/>
+          <w:sz w:val="18"/>
+        </w:rPr>
+        <w:t>发表月份：2026-02</w:t>
+      </w:r>
+    </w:p>
+    <w:p>
+      <w:r>
+        <w:rPr>
+          <w:rFonts w:ascii="Microsoft YaHei" w:hAnsi="Microsoft YaHei" w:eastAsia="Microsoft YaHei"/>
+          <w:color w:val="55697D"/>
+          <w:sz w:val="18"/>
+        </w:rPr>
+        <w:t>DOI：10.1029/2025jc022543</w:t>
+      </w:r>
+    </w:p>
+    <w:p>
+      <w:r>
+        <w:rPr>
+          <w:rFonts w:ascii="Microsoft YaHei" w:hAnsi="Microsoft YaHei" w:eastAsia="Microsoft YaHei"/>
+          <w:b/>
+          <w:sz w:val="19"/>
+        </w:rPr>
+        <w:t>关键词：BGC-Argo; phytoplankton</w:t>
+      </w:r>
+    </w:p>
+    <w:p>
+      <w:r>
+        <w:rPr>
+          <w:rFonts w:ascii="Microsoft YaHei" w:hAnsi="Microsoft YaHei" w:eastAsia="Microsoft YaHei"/>
+        </w:rPr>
+        <w:t>这项研究关注BGC-Argo 剖面约束的生物地球化学变化。 数据基础是 BGC-Argo 浮标剖面及相关生物地球化学观测，可用于连接垂向结构和过程变化。 研究主要分析变化趋势、事件响应、驱动机制或方法表现，并把观测结果与生态和生物地球化学过程联系起来。 核心结果或实现为该主题提供了新的观测约束、方法基准或过程解释。 它有助于解释观测现象、比较方法差异，并为后续海洋生物地球化学分析提供线索。</w:t>
+      </w:r>
+    </w:p>
+    <w:p>
+      <w:r>
+        <w:rPr>
+          <w:rFonts w:ascii="Microsoft YaHei" w:hAnsi="Microsoft YaHei" w:eastAsia="Microsoft YaHei"/>
+          <w:color w:val="0563C1"/>
+          <w:sz w:val="18"/>
+        </w:rPr>
+        <w:t>链接：https://doi.org/10.1029/2025jc022543</w:t>
+      </w:r>
+    </w:p>
+    <w:p>
+      <w:pPr>
+        <w:pStyle w:val="Heading3"/>
+      </w:pPr>
+      <w:r>
+        <w:rPr>
+          <w:rFonts w:ascii="Microsoft YaHei" w:hAnsi="Microsoft YaHei" w:eastAsia="Microsoft YaHei"/>
+          <w:b/>
+        </w:rPr>
+        <w:t>3. Fresh Phytoplankton Bloom Growth in the Fall and Its Control on Ocean Heating in the Pacific Arctic Region</w:t>
+      </w:r>
+    </w:p>
+    <w:p>
+      <w:r>
+        <w:rPr>
+          <w:rFonts w:ascii="Microsoft YaHei" w:hAnsi="Microsoft YaHei" w:eastAsia="Microsoft YaHei"/>
+          <w:color w:val="55697D"/>
+          <w:sz w:val="18"/>
+        </w:rPr>
+        <w:t>作者：Clare B. Gaffey; Karen E. Frey; Bonnie Light; Lee W. Cooper; Jacqueline M. Grebmeier</w:t>
+      </w:r>
+    </w:p>
+    <w:p>
+      <w:r>
+        <w:rPr>
+          <w:rFonts w:ascii="Microsoft YaHei" w:hAnsi="Microsoft YaHei" w:eastAsia="Microsoft YaHei"/>
+          <w:color w:val="55697D"/>
+          <w:sz w:val="18"/>
+        </w:rPr>
+        <w:t>期刊：Journal of Geophysical Research: Oceans</w:t>
+      </w:r>
+    </w:p>
+    <w:p>
+      <w:r>
+        <w:rPr>
+          <w:rFonts w:ascii="Microsoft YaHei" w:hAnsi="Microsoft YaHei" w:eastAsia="Microsoft YaHei"/>
+          <w:color w:val="55697D"/>
+          <w:sz w:val="18"/>
+        </w:rPr>
+        <w:t>发表月份：2026-05</w:t>
+      </w:r>
+    </w:p>
+    <w:p>
+      <w:r>
+        <w:rPr>
+          <w:rFonts w:ascii="Microsoft YaHei" w:hAnsi="Microsoft YaHei" w:eastAsia="Microsoft YaHei"/>
+          <w:color w:val="55697D"/>
+          <w:sz w:val="18"/>
+        </w:rPr>
+        <w:t>DOI：10.1029/2025jc022895</w:t>
+      </w:r>
+    </w:p>
+    <w:p>
+      <w:r>
+        <w:rPr>
+          <w:rFonts w:ascii="Microsoft YaHei" w:hAnsi="Microsoft YaHei" w:eastAsia="Microsoft YaHei"/>
+          <w:b/>
+          <w:sz w:val="19"/>
+        </w:rPr>
+        <w:t>关键词：phytoplankton; bio-optics; vertical structure</w:t>
+      </w:r>
+    </w:p>
+    <w:p>
+      <w:r>
+        <w:rPr>
+          <w:rFonts w:ascii="Microsoft YaHei" w:hAnsi="Microsoft YaHei" w:eastAsia="Microsoft YaHei"/>
+        </w:rPr>
+        <w:t>这项研究关注海洋生物光学和海洋光学参数、方法与应用。 数据或方法上围绕沉积物捕获器、原位光学、生物光学参数或光谱观测展开。 研究主要分析变化趋势、事件响应、驱动机制或方法表现，并把观测结果与生态和生物地球化学过程联系起来。 核心结果或实现为该主题提供了新的观测约束、方法基准或过程解释。 它有助于解释观测现象、比较方法差异，并为后续海洋生物地球化学分析提供线索。</w:t>
+      </w:r>
+    </w:p>
+    <w:p>
+      <w:r>
+        <w:rPr>
+          <w:rFonts w:ascii="Microsoft YaHei" w:hAnsi="Microsoft YaHei" w:eastAsia="Microsoft YaHei"/>
+          <w:color w:val="0563C1"/>
+          <w:sz w:val="18"/>
+        </w:rPr>
+        <w:t>链接：https://doi.org/10.1029/2025jc022895</w:t>
+      </w:r>
+    </w:p>
+    <w:p>
+      <w:pPr>
+        <w:pStyle w:val="Heading3"/>
+      </w:pPr>
+      <w:r>
+        <w:rPr>
+          <w:rFonts w:ascii="Microsoft YaHei" w:hAnsi="Microsoft YaHei" w:eastAsia="Microsoft YaHei"/>
+          <w:b/>
+        </w:rPr>
+        <w:t>4. Distribution and Export of Particulate 3‐Hydroxy Fatty Acids in the Northwestern Pacific Ocean: Implications for Seawater Temperature Reconstructions</w:t>
+      </w:r>
+    </w:p>
+    <w:p>
+      <w:r>
+        <w:rPr>
+          <w:rFonts w:ascii="Microsoft YaHei" w:hAnsi="Microsoft YaHei" w:eastAsia="Microsoft YaHei"/>
+          <w:color w:val="55697D"/>
+          <w:sz w:val="18"/>
+        </w:rPr>
+        <w:t>作者：Fengmin Pan; Huamao Yuan; Jinming Song; Xuegang Li; Liqin Duan</w:t>
+      </w:r>
+    </w:p>
+    <w:p>
+      <w:r>
+        <w:rPr>
+          <w:rFonts w:ascii="Microsoft YaHei" w:hAnsi="Microsoft YaHei" w:eastAsia="Microsoft YaHei"/>
+          <w:color w:val="55697D"/>
+          <w:sz w:val="18"/>
+        </w:rPr>
+        <w:t>期刊：Journal of Geophysical Research: Oceans</w:t>
+      </w:r>
+    </w:p>
+    <w:p>
+      <w:r>
+        <w:rPr>
+          <w:rFonts w:ascii="Microsoft YaHei" w:hAnsi="Microsoft YaHei" w:eastAsia="Microsoft YaHei"/>
+          <w:color w:val="55697D"/>
+          <w:sz w:val="18"/>
+        </w:rPr>
         <w:t>发表月份：2026-06</w:t>
       </w:r>
     </w:p>
@@ -110,7 +350,87 @@
           <w:color w:val="55697D"/>
           <w:sz w:val="18"/>
         </w:rPr>
-        <w:t>DOI：10.1029/2025gb008954</w:t>
+        <w:t>DOI：10.1029/2026jc024079</w:t>
+      </w:r>
+    </w:p>
+    <w:p>
+      <w:r>
+        <w:rPr>
+          <w:rFonts w:ascii="Microsoft YaHei" w:hAnsi="Microsoft YaHei" w:eastAsia="Microsoft YaHei"/>
+          <w:b/>
+          <w:sz w:val="19"/>
+        </w:rPr>
+        <w:t>关键词：carbon pump; vertical structure</w:t>
+      </w:r>
+    </w:p>
+    <w:p>
+      <w:r>
+        <w:rPr>
+          <w:rFonts w:ascii="Microsoft YaHei" w:hAnsi="Microsoft YaHei" w:eastAsia="Microsoft YaHei"/>
+        </w:rPr>
+        <w:t>这项研究关注有机碳输出和生物碳泵过程。 研究结合观测、模型或实验结果来刻画海洋生态和生物地球化学过程。 研究主要分析变化趋势、事件响应、驱动机制或方法表现，并把观测结果与生态和生物地球化学过程联系起来。 核心结果或实现为该主题提供了新的观测约束、方法基准或过程解释。 它有助于解释观测现象、比较方法差异，并为后续海洋生物地球化学分析提供线索。</w:t>
+      </w:r>
+    </w:p>
+    <w:p>
+      <w:r>
+        <w:rPr>
+          <w:rFonts w:ascii="Microsoft YaHei" w:hAnsi="Microsoft YaHei" w:eastAsia="Microsoft YaHei"/>
+          <w:color w:val="0563C1"/>
+          <w:sz w:val="18"/>
+        </w:rPr>
+        <w:t>链接：https://doi.org/10.1029/2026jc024079</w:t>
+      </w:r>
+    </w:p>
+    <w:p>
+      <w:pPr>
+        <w:pStyle w:val="Heading3"/>
+      </w:pPr>
+      <w:r>
+        <w:rPr>
+          <w:rFonts w:ascii="Microsoft YaHei" w:hAnsi="Microsoft YaHei" w:eastAsia="Microsoft YaHei"/>
+          <w:b/>
+        </w:rPr>
+        <w:t>5. Amplifying effects of multiyear La Niña on phytoplankton biomass in the tropical Pacific</w:t>
+      </w:r>
+    </w:p>
+    <w:p>
+      <w:r>
+        <w:rPr>
+          <w:rFonts w:ascii="Microsoft YaHei" w:hAnsi="Microsoft YaHei" w:eastAsia="Microsoft YaHei"/>
+          <w:color w:val="55697D"/>
+          <w:sz w:val="18"/>
+        </w:rPr>
+        <w:t>作者：Lei Lin; Kun Xu; Wei Tan; Jinliang Liu; Bingzhang Chen; Dongyan Liu</w:t>
+      </w:r>
+    </w:p>
+    <w:p>
+      <w:r>
+        <w:rPr>
+          <w:rFonts w:ascii="Microsoft YaHei" w:hAnsi="Microsoft YaHei" w:eastAsia="Microsoft YaHei"/>
+          <w:color w:val="55697D"/>
+          <w:sz w:val="18"/>
+        </w:rPr>
+        <w:t>期刊：Limnology and Oceanography</w:t>
+      </w:r>
+    </w:p>
+    <w:p>
+      <w:r>
+        <w:rPr>
+          <w:rFonts w:ascii="Microsoft YaHei" w:hAnsi="Microsoft YaHei" w:eastAsia="Microsoft YaHei"/>
+          <w:color w:val="55697D"/>
+          <w:sz w:val="18"/>
+        </w:rPr>
+        <w:t>发表月份：2026-05</w:t>
+      </w:r>
+    </w:p>
+    <w:p>
+      <w:r>
+        <w:rPr>
+          <w:rFonts w:ascii="Microsoft YaHei" w:hAnsi="Microsoft YaHei" w:eastAsia="Microsoft YaHei"/>
+          <w:color w:val="55697D"/>
+          <w:sz w:val="18"/>
+        </w:rPr>
+        <w:t>DOI：10.1002/lol2.70143</w:t>
       </w:r>
     </w:p>
     <w:p>
@@ -138,7 +458,895 @@
           <w:color w:val="0563C1"/>
           <w:sz w:val="18"/>
         </w:rPr>
-        <w:t>链接：https://doi.org/10.1029/2025gb008954</w:t>
+        <w:t>链接：https://doi.org/10.1002/lol2.70143</w:t>
+      </w:r>
+    </w:p>
+    <w:p>
+      <w:pPr>
+        <w:pStyle w:val="Heading3"/>
+      </w:pPr>
+      <w:r>
+        <w:rPr>
+          <w:rFonts w:ascii="Microsoft YaHei" w:hAnsi="Microsoft YaHei" w:eastAsia="Microsoft YaHei"/>
+          <w:b/>
+        </w:rPr>
+        <w:t>6. The impact of large-scale macroalgae cultivation and harvesting strategies on the marine carbon dioxide removal efficacy and marine biogeochemistry</w:t>
+      </w:r>
+    </w:p>
+    <w:p>
+      <w:r>
+        <w:rPr>
+          <w:rFonts w:ascii="Microsoft YaHei" w:hAnsi="Microsoft YaHei" w:eastAsia="Microsoft YaHei"/>
+          <w:color w:val="55697D"/>
+          <w:sz w:val="18"/>
+        </w:rPr>
+        <w:t>作者：Prima Anugerahanti; Julien Palmiéri; Chelsey A. Baker; Ekaterina Popova; Andrew Yool</w:t>
+      </w:r>
+    </w:p>
+    <w:p>
+      <w:r>
+        <w:rPr>
+          <w:rFonts w:ascii="Microsoft YaHei" w:hAnsi="Microsoft YaHei" w:eastAsia="Microsoft YaHei"/>
+          <w:color w:val="55697D"/>
+          <w:sz w:val="18"/>
+        </w:rPr>
+        <w:t>期刊：Biogeosciences</w:t>
+      </w:r>
+    </w:p>
+    <w:p>
+      <w:r>
+        <w:rPr>
+          <w:rFonts w:ascii="Microsoft YaHei" w:hAnsi="Microsoft YaHei" w:eastAsia="Microsoft YaHei"/>
+          <w:color w:val="55697D"/>
+          <w:sz w:val="18"/>
+        </w:rPr>
+        <w:t>发表月份：2026-06</w:t>
+      </w:r>
+    </w:p>
+    <w:p>
+      <w:r>
+        <w:rPr>
+          <w:rFonts w:ascii="Microsoft YaHei" w:hAnsi="Microsoft YaHei" w:eastAsia="Microsoft YaHei"/>
+          <w:color w:val="55697D"/>
+          <w:sz w:val="18"/>
+        </w:rPr>
+        <w:t>DOI：10.5194/bg-23-3735-2026</w:t>
+      </w:r>
+    </w:p>
+    <w:p>
+      <w:r>
+        <w:rPr>
+          <w:rFonts w:ascii="Microsoft YaHei" w:hAnsi="Microsoft YaHei" w:eastAsia="Microsoft YaHei"/>
+          <w:b/>
+          <w:sz w:val="19"/>
+        </w:rPr>
+        <w:t>关键词：phytoplankton</w:t>
+      </w:r>
+    </w:p>
+    <w:p>
+      <w:r>
+        <w:rPr>
+          <w:rFonts w:ascii="Microsoft YaHei" w:hAnsi="Microsoft YaHei" w:eastAsia="Microsoft YaHei"/>
+        </w:rPr>
+        <w:t>这项研究关注浮游植物群落、生理状态和生产力变化。 研究结合观测、模型或实验结果来刻画海洋生态和生物地球化学过程。 研究主要分析变化趋势、事件响应、驱动机制或方法表现，并把观测结果与生态和生物地球化学过程联系起来。 核心结果或实现为该主题提供了新的观测约束、方法基准或过程解释。 它有助于解释观测现象、比较方法差异，并为后续海洋生物地球化学分析提供线索。</w:t>
+      </w:r>
+    </w:p>
+    <w:p>
+      <w:r>
+        <w:rPr>
+          <w:rFonts w:ascii="Microsoft YaHei" w:hAnsi="Microsoft YaHei" w:eastAsia="Microsoft YaHei"/>
+          <w:color w:val="0563C1"/>
+          <w:sz w:val="18"/>
+        </w:rPr>
+        <w:t>链接：https://doi.org/10.5194/bg-23-3735-2026</w:t>
+      </w:r>
+    </w:p>
+    <w:p>
+      <w:pPr>
+        <w:pStyle w:val="Heading3"/>
+      </w:pPr>
+      <w:r>
+        <w:rPr>
+          <w:rFonts w:ascii="Microsoft YaHei" w:hAnsi="Microsoft YaHei" w:eastAsia="Microsoft YaHei"/>
+          <w:b/>
+        </w:rPr>
+        <w:t>7. Trait-Based Micro-Phytoplankton Community Structure Across Hydrographic Gradients in the Eastern Indian Ocean</w:t>
+      </w:r>
+    </w:p>
+    <w:p>
+      <w:r>
+        <w:rPr>
+          <w:rFonts w:ascii="Microsoft YaHei" w:hAnsi="Microsoft YaHei" w:eastAsia="Microsoft YaHei"/>
+          <w:color w:val="55697D"/>
+          <w:sz w:val="18"/>
+        </w:rPr>
+        <w:t>作者：Aparna Mol T A; Jagadish S Patil; Pranoy Paul</w:t>
+      </w:r>
+    </w:p>
+    <w:p>
+      <w:r>
+        <w:rPr>
+          <w:rFonts w:ascii="Microsoft YaHei" w:hAnsi="Microsoft YaHei" w:eastAsia="Microsoft YaHei"/>
+          <w:color w:val="55697D"/>
+          <w:sz w:val="18"/>
+        </w:rPr>
+        <w:t>期刊：Deep Sea Research Part II: Topical Studies in Oceanography</w:t>
+      </w:r>
+    </w:p>
+    <w:p>
+      <w:r>
+        <w:rPr>
+          <w:rFonts w:ascii="Microsoft YaHei" w:hAnsi="Microsoft YaHei" w:eastAsia="Microsoft YaHei"/>
+          <w:color w:val="55697D"/>
+          <w:sz w:val="18"/>
+        </w:rPr>
+        <w:t>发表月份：2026-05</w:t>
+      </w:r>
+    </w:p>
+    <w:p>
+      <w:r>
+        <w:rPr>
+          <w:rFonts w:ascii="Microsoft YaHei" w:hAnsi="Microsoft YaHei" w:eastAsia="Microsoft YaHei"/>
+          <w:color w:val="55697D"/>
+          <w:sz w:val="18"/>
+        </w:rPr>
+        <w:t>DOI：10.1016/j.dsr2.2026.105663</w:t>
+      </w:r>
+    </w:p>
+    <w:p>
+      <w:r>
+        <w:rPr>
+          <w:rFonts w:ascii="Microsoft YaHei" w:hAnsi="Microsoft YaHei" w:eastAsia="Microsoft YaHei"/>
+          <w:b/>
+          <w:sz w:val="19"/>
+        </w:rPr>
+        <w:t>关键词：phytoplankton</w:t>
+      </w:r>
+    </w:p>
+    <w:p>
+      <w:r>
+        <w:rPr>
+          <w:rFonts w:ascii="Microsoft YaHei" w:hAnsi="Microsoft YaHei" w:eastAsia="Microsoft YaHei"/>
+        </w:rPr>
+        <w:t>这项研究关注浮游植物群落、生理状态和生产力变化。 研究结合观测、模型或实验结果来刻画海洋生态和生物地球化学过程。 研究主要分析变化趋势、事件响应、驱动机制或方法表现，并把观测结果与生态和生物地球化学过程联系起来。 核心结果或实现为该主题提供了新的观测约束、方法基准或过程解释。 它有助于解释观测现象、比较方法差异，并为后续海洋生物地球化学分析提供线索。</w:t>
+      </w:r>
+    </w:p>
+    <w:p>
+      <w:r>
+        <w:rPr>
+          <w:rFonts w:ascii="Microsoft YaHei" w:hAnsi="Microsoft YaHei" w:eastAsia="Microsoft YaHei"/>
+          <w:color w:val="0563C1"/>
+          <w:sz w:val="18"/>
+        </w:rPr>
+        <w:t>链接：https://doi.org/10.1016/j.dsr2.2026.105663</w:t>
+      </w:r>
+    </w:p>
+    <w:p>
+      <w:pPr>
+        <w:pStyle w:val="Heading3"/>
+      </w:pPr>
+      <w:r>
+        <w:rPr>
+          <w:rFonts w:ascii="Microsoft YaHei" w:hAnsi="Microsoft YaHei" w:eastAsia="Microsoft YaHei"/>
+          <w:b/>
+        </w:rPr>
+        <w:t>8. Achieving Consistent Estimates of Particulate Organic Carbon from Satellites, Ships and Argo Floats</w:t>
+      </w:r>
+    </w:p>
+    <w:p>
+      <w:r>
+        <w:rPr>
+          <w:rFonts w:ascii="Microsoft YaHei" w:hAnsi="Microsoft YaHei" w:eastAsia="Microsoft YaHei"/>
+          <w:color w:val="55697D"/>
+          <w:sz w:val="18"/>
+        </w:rPr>
+        <w:t>作者：Graham D. Quartly; Shubha Sathyendranath; Martí Galí</w:t>
+      </w:r>
+    </w:p>
+    <w:p>
+      <w:r>
+        <w:rPr>
+          <w:rFonts w:ascii="Microsoft YaHei" w:hAnsi="Microsoft YaHei" w:eastAsia="Microsoft YaHei"/>
+          <w:color w:val="55697D"/>
+          <w:sz w:val="18"/>
+        </w:rPr>
+        <w:t>期刊：Remote Sensing</w:t>
+      </w:r>
+    </w:p>
+    <w:p>
+      <w:r>
+        <w:rPr>
+          <w:rFonts w:ascii="Microsoft YaHei" w:hAnsi="Microsoft YaHei" w:eastAsia="Microsoft YaHei"/>
+          <w:color w:val="55697D"/>
+          <w:sz w:val="18"/>
+        </w:rPr>
+        <w:t>发表月份：2026-03</w:t>
+      </w:r>
+    </w:p>
+    <w:p>
+      <w:r>
+        <w:rPr>
+          <w:rFonts w:ascii="Microsoft YaHei" w:hAnsi="Microsoft YaHei" w:eastAsia="Microsoft YaHei"/>
+          <w:color w:val="55697D"/>
+          <w:sz w:val="18"/>
+        </w:rPr>
+        <w:t>DOI：10.3390/rs18050832</w:t>
+      </w:r>
+    </w:p>
+    <w:p>
+      <w:r>
+        <w:rPr>
+          <w:rFonts w:ascii="Microsoft YaHei" w:hAnsi="Microsoft YaHei" w:eastAsia="Microsoft YaHei"/>
+          <w:b/>
+          <w:sz w:val="19"/>
+        </w:rPr>
+        <w:t>关键词：BGC-Argo; carbon pump; phytoplankton; ocean colour; backscattering</w:t>
+      </w:r>
+    </w:p>
+    <w:p>
+      <w:r>
+        <w:rPr>
+          <w:rFonts w:ascii="Microsoft YaHei" w:hAnsi="Microsoft YaHei" w:eastAsia="Microsoft YaHei"/>
+        </w:rPr>
+        <w:t>这项研究关注BGC-Argo 剖面约束的生物地球化学变化。 数据基础是 BGC-Argo 浮标剖面及相关生物地球化学观测，可用于连接垂向结构和过程变化。 研究主要分析变化趋势、事件响应、驱动机制或方法表现，并把观测结果与生态和生物地球化学过程联系起来。 核心结果或实现为该主题提供了新的观测约束、方法基准或过程解释。 它有助于解释观测现象、比较方法差异，并为后续海洋生物地球化学分析提供线索。</w:t>
+      </w:r>
+    </w:p>
+    <w:p>
+      <w:r>
+        <w:rPr>
+          <w:rFonts w:ascii="Microsoft YaHei" w:hAnsi="Microsoft YaHei" w:eastAsia="Microsoft YaHei"/>
+          <w:color w:val="0563C1"/>
+          <w:sz w:val="18"/>
+        </w:rPr>
+        <w:t>链接：https://doi.org/10.3390/rs18050832</w:t>
+      </w:r>
+    </w:p>
+    <w:p>
+      <w:pPr>
+        <w:pStyle w:val="Heading3"/>
+      </w:pPr>
+      <w:r>
+        <w:rPr>
+          <w:rFonts w:ascii="Microsoft YaHei" w:hAnsi="Microsoft YaHei" w:eastAsia="Microsoft YaHei"/>
+          <w:b/>
+        </w:rPr>
+        <w:t>9. Decline in satellite-derived primary production in the north-east Atlantic driven by changes in sea surface temperature and mixed layer depth</w:t>
+      </w:r>
+    </w:p>
+    <w:p>
+      <w:r>
+        <w:rPr>
+          <w:rFonts w:ascii="Microsoft YaHei" w:hAnsi="Microsoft YaHei" w:eastAsia="Microsoft YaHei"/>
+          <w:color w:val="55697D"/>
+          <w:sz w:val="18"/>
+        </w:rPr>
+        <w:t>作者：Gavin H. Tilstone; Peter E. Land</w:t>
+      </w:r>
+    </w:p>
+    <w:p>
+      <w:r>
+        <w:rPr>
+          <w:rFonts w:ascii="Microsoft YaHei" w:hAnsi="Microsoft YaHei" w:eastAsia="Microsoft YaHei"/>
+          <w:color w:val="55697D"/>
+          <w:sz w:val="18"/>
+        </w:rPr>
+        <w:t>期刊：Remote Sensing</w:t>
+      </w:r>
+    </w:p>
+    <w:p>
+      <w:r>
+        <w:rPr>
+          <w:rFonts w:ascii="Microsoft YaHei" w:hAnsi="Microsoft YaHei" w:eastAsia="Microsoft YaHei"/>
+          <w:color w:val="55697D"/>
+          <w:sz w:val="18"/>
+        </w:rPr>
+        <w:t>发表月份：2026-06</w:t>
+      </w:r>
+    </w:p>
+    <w:p>
+      <w:r>
+        <w:rPr>
+          <w:rFonts w:ascii="Microsoft YaHei" w:hAnsi="Microsoft YaHei" w:eastAsia="Microsoft YaHei"/>
+          <w:color w:val="55697D"/>
+          <w:sz w:val="18"/>
+        </w:rPr>
+        <w:t>DOI：10.3389/frsen.2026.1703257</w:t>
+      </w:r>
+    </w:p>
+    <w:p>
+      <w:r>
+        <w:rPr>
+          <w:rFonts w:ascii="Microsoft YaHei" w:hAnsi="Microsoft YaHei" w:eastAsia="Microsoft YaHei"/>
+          <w:b/>
+          <w:sz w:val="19"/>
+        </w:rPr>
+        <w:t>关键词：phytoplankton; ocean colour</w:t>
+      </w:r>
+    </w:p>
+    <w:p>
+      <w:r>
+        <w:rPr>
+          <w:rFonts w:ascii="Microsoft YaHei" w:hAnsi="Microsoft YaHei" w:eastAsia="Microsoft YaHei"/>
+        </w:rPr>
+        <w:t>这项研究关注海色遥感中的浮游植物和光学信号变化。 数据上主要面向卫星海色、叶绿素或遥感反射率记录，并在需要时结合原位或剖面观测进行约束。 研究主要分析变化趋势、事件响应、驱动机制或方法表现，并把观测结果与生态和生物地球化学过程联系起来。 核心结果是识别出上升、下降或异常事件信号，并把这些变化放进气候变暖、生产力或碳循环背景下解释。 它有助于解释观测现象、比较方法差异，并为后续海洋生物地球化学分析提供线索。</w:t>
+      </w:r>
+    </w:p>
+    <w:p>
+      <w:r>
+        <w:rPr>
+          <w:rFonts w:ascii="Microsoft YaHei" w:hAnsi="Microsoft YaHei" w:eastAsia="Microsoft YaHei"/>
+          <w:color w:val="0563C1"/>
+          <w:sz w:val="18"/>
+        </w:rPr>
+        <w:t>链接：https://doi.org/10.3389/frsen.2026.1703257</w:t>
+      </w:r>
+    </w:p>
+    <w:p>
+      <w:pPr>
+        <w:pStyle w:val="Heading2"/>
+      </w:pPr>
+      <w:r>
+        <w:t>其他相关期刊：按主题相关性补充</w:t>
+      </w:r>
+    </w:p>
+    <w:p>
+      <w:pPr>
+        <w:pStyle w:val="Heading3"/>
+      </w:pPr>
+      <w:r>
+        <w:rPr>
+          <w:rFonts w:ascii="Microsoft YaHei" w:hAnsi="Microsoft YaHei" w:eastAsia="Microsoft YaHei"/>
+          <w:b/>
+        </w:rPr>
+        <w:t>10. Identification of phytoplankton pigment assemblages using derivative spectroscopy of hyperspectral remote-sensing reflectances</w:t>
+      </w:r>
+    </w:p>
+    <w:p>
+      <w:r>
+        <w:rPr>
+          <w:rFonts w:ascii="Microsoft YaHei" w:hAnsi="Microsoft YaHei" w:eastAsia="Microsoft YaHei"/>
+          <w:color w:val="55697D"/>
+          <w:sz w:val="18"/>
+        </w:rPr>
+        <w:t>作者：Elena Torrecilla Ribalta; Jaume Piera Fernández; D. Stramski; R. Reynolds; E. Millán-Nuñez</w:t>
+      </w:r>
+    </w:p>
+    <w:p>
+      <w:r>
+        <w:rPr>
+          <w:rFonts w:ascii="Microsoft YaHei" w:hAnsi="Microsoft YaHei" w:eastAsia="Microsoft YaHei"/>
+          <w:color w:val="55697D"/>
+          <w:sz w:val="18"/>
+        </w:rPr>
+        <w:t>期刊：Instrumentation Viewpoint</w:t>
+      </w:r>
+    </w:p>
+    <w:p>
+      <w:r>
+        <w:rPr>
+          <w:rFonts w:ascii="Microsoft YaHei" w:hAnsi="Microsoft YaHei" w:eastAsia="Microsoft YaHei"/>
+          <w:color w:val="55697D"/>
+          <w:sz w:val="18"/>
+        </w:rPr>
+        <w:t>发表月份：2010-04</w:t>
+      </w:r>
+    </w:p>
+    <w:p>
+      <w:r>
+        <w:rPr>
+          <w:rFonts w:ascii="Microsoft YaHei" w:hAnsi="Microsoft YaHei" w:eastAsia="Microsoft YaHei"/>
+          <w:color w:val="55697D"/>
+          <w:sz w:val="18"/>
+        </w:rPr>
+        <w:t>DOI：10.5821/iwp.2009.8.15680</w:t>
+      </w:r>
+    </w:p>
+    <w:p>
+      <w:r>
+        <w:rPr>
+          <w:rFonts w:ascii="Microsoft YaHei" w:hAnsi="Microsoft YaHei" w:eastAsia="Microsoft YaHei"/>
+          <w:b/>
+          <w:sz w:val="19"/>
+        </w:rPr>
+        <w:t>关键词：phytoplankton; ocean colour; ocean optics</w:t>
+      </w:r>
+    </w:p>
+    <w:p>
+      <w:r>
+        <w:rPr>
+          <w:rFonts w:ascii="Microsoft YaHei" w:hAnsi="Microsoft YaHei" w:eastAsia="Microsoft YaHei"/>
+        </w:rPr>
+        <w:t>这项研究关注海洋生物光学和海洋光学参数、方法与应用。 数据上主要面向卫星海色、叶绿素或遥感反射率记录，并在需要时结合原位或剖面观测进行约束。 研究主要分析变化趋势、事件响应、驱动机制或方法表现，并把观测结果与生态和生物地球化学过程联系起来。 核心结果或实现为该主题提供了新的观测约束、方法基准或过程解释。 它有助于解释观测现象、比较方法差异，并为后续海洋生物地球化学分析提供线索。</w:t>
+      </w:r>
+    </w:p>
+    <w:p>
+      <w:r>
+        <w:rPr>
+          <w:rFonts w:ascii="Microsoft YaHei" w:hAnsi="Microsoft YaHei" w:eastAsia="Microsoft YaHei"/>
+          <w:color w:val="0563C1"/>
+          <w:sz w:val="18"/>
+        </w:rPr>
+        <w:t>链接：https://doi.org/10.5821/iwp.2009.8.15680</w:t>
+      </w:r>
+    </w:p>
+    <w:p>
+      <w:pPr>
+        <w:pStyle w:val="Heading3"/>
+      </w:pPr>
+      <w:r>
+        <w:rPr>
+          <w:rFonts w:ascii="Microsoft YaHei" w:hAnsi="Microsoft YaHei" w:eastAsia="Microsoft YaHei"/>
+          <w:b/>
+        </w:rPr>
+        <w:t>11. Phytoplankton Bloom and Enhanced Carbon Uptake Induced by Marine Heatwaves in the Mid-High Latitudes of the Northwestern Pacific in 2022 and 2023</w:t>
+      </w:r>
+    </w:p>
+    <w:p>
+      <w:r>
+        <w:rPr>
+          <w:rFonts w:ascii="Microsoft YaHei" w:hAnsi="Microsoft YaHei" w:eastAsia="Microsoft YaHei"/>
+          <w:color w:val="55697D"/>
+          <w:sz w:val="18"/>
+        </w:rPr>
+        <w:t>作者：立斌 董</w:t>
+      </w:r>
+    </w:p>
+    <w:p>
+      <w:r>
+        <w:rPr>
+          <w:rFonts w:ascii="Microsoft YaHei" w:hAnsi="Microsoft YaHei" w:eastAsia="Microsoft YaHei"/>
+          <w:color w:val="55697D"/>
+          <w:sz w:val="18"/>
+        </w:rPr>
+        <w:t>期刊：Climate Change Research Letters</w:t>
+      </w:r>
+    </w:p>
+    <w:p>
+      <w:r>
+        <w:rPr>
+          <w:rFonts w:ascii="Microsoft YaHei" w:hAnsi="Microsoft YaHei" w:eastAsia="Microsoft YaHei"/>
+          <w:color w:val="55697D"/>
+          <w:sz w:val="18"/>
+        </w:rPr>
+        <w:t>发表月份：2026（月份未核准）</w:t>
+      </w:r>
+    </w:p>
+    <w:p>
+      <w:r>
+        <w:rPr>
+          <w:rFonts w:ascii="Microsoft YaHei" w:hAnsi="Microsoft YaHei" w:eastAsia="Microsoft YaHei"/>
+          <w:color w:val="55697D"/>
+          <w:sz w:val="18"/>
+        </w:rPr>
+        <w:t>DOI：10.12677/ccrl.2026.153070</w:t>
+      </w:r>
+    </w:p>
+    <w:p>
+      <w:r>
+        <w:rPr>
+          <w:rFonts w:ascii="Microsoft YaHei" w:hAnsi="Microsoft YaHei" w:eastAsia="Microsoft YaHei"/>
+          <w:b/>
+          <w:sz w:val="19"/>
+        </w:rPr>
+        <w:t>关键词：phytoplankton; marine heatwaves</w:t>
+      </w:r>
+    </w:p>
+    <w:p>
+      <w:r>
+        <w:rPr>
+          <w:rFonts w:ascii="Microsoft YaHei" w:hAnsi="Microsoft YaHei" w:eastAsia="Microsoft YaHei"/>
+        </w:rPr>
+        <w:t>这项研究关注海洋热浪对生态结构和碳循环的影响。 研究结合观测、模型或实验结果来刻画海洋生态和生物地球化学过程。 研究主要分析变化趋势、事件响应、驱动机制或方法表现，并把观测结果与生态和生物地球化学过程联系起来。 核心结果帮助说明海洋热浪如何通过强度、持续时间或垂向结构影响生态和碳循环过程。 它有助于解释观测现象、比较方法差异，并为后续海洋生物地球化学分析提供线索。</w:t>
+      </w:r>
+    </w:p>
+    <w:p>
+      <w:r>
+        <w:rPr>
+          <w:rFonts w:ascii="Microsoft YaHei" w:hAnsi="Microsoft YaHei" w:eastAsia="Microsoft YaHei"/>
+          <w:color w:val="0563C1"/>
+          <w:sz w:val="18"/>
+        </w:rPr>
+        <w:t>链接：https://doi.org/10.12677/ccrl.2026.153070</w:t>
+      </w:r>
+    </w:p>
+    <w:p>
+      <w:pPr>
+        <w:pStyle w:val="Heading3"/>
+      </w:pPr>
+      <w:r>
+        <w:rPr>
+          <w:rFonts w:ascii="Microsoft YaHei" w:hAnsi="Microsoft YaHei" w:eastAsia="Microsoft YaHei"/>
+          <w:b/>
+        </w:rPr>
+        <w:t>12. Review of potential impacts of marine heatwaves in the Caribbean, Gulf and Southeastern U.S</w:t>
+      </w:r>
+    </w:p>
+    <w:p>
+      <w:r>
+        <w:rPr>
+          <w:rFonts w:ascii="Microsoft YaHei" w:hAnsi="Microsoft YaHei" w:eastAsia="Microsoft YaHei"/>
+          <w:color w:val="55697D"/>
+          <w:sz w:val="18"/>
+        </w:rPr>
+        <w:t>作者：Renata Poulton Kamakura; Chris Simoniello; Devanarayana R.M. Rao; Brian Dzwonkowski; Xiao Qi; Megan Howson; Jorge Brenner</w:t>
+      </w:r>
+    </w:p>
+    <w:p>
+      <w:r>
+        <w:rPr>
+          <w:rFonts w:ascii="Microsoft YaHei" w:hAnsi="Microsoft YaHei" w:eastAsia="Microsoft YaHei"/>
+          <w:color w:val="55697D"/>
+          <w:sz w:val="18"/>
+        </w:rPr>
+        <w:t>期刊：Environmental Research Communications</w:t>
+      </w:r>
+    </w:p>
+    <w:p>
+      <w:r>
+        <w:rPr>
+          <w:rFonts w:ascii="Microsoft YaHei" w:hAnsi="Microsoft YaHei" w:eastAsia="Microsoft YaHei"/>
+          <w:color w:val="55697D"/>
+          <w:sz w:val="18"/>
+        </w:rPr>
+        <w:t>发表月份：2026-06</w:t>
+      </w:r>
+    </w:p>
+    <w:p>
+      <w:r>
+        <w:rPr>
+          <w:rFonts w:ascii="Microsoft YaHei" w:hAnsi="Microsoft YaHei" w:eastAsia="Microsoft YaHei"/>
+          <w:color w:val="55697D"/>
+          <w:sz w:val="18"/>
+        </w:rPr>
+        <w:t>DOI：10.1088/2515-7620/ae78b5</w:t>
+      </w:r>
+    </w:p>
+    <w:p>
+      <w:r>
+        <w:rPr>
+          <w:rFonts w:ascii="Microsoft YaHei" w:hAnsi="Microsoft YaHei" w:eastAsia="Microsoft YaHei"/>
+          <w:b/>
+          <w:sz w:val="19"/>
+        </w:rPr>
+        <w:t>关键词：marine heatwaves</w:t>
+      </w:r>
+    </w:p>
+    <w:p>
+      <w:r>
+        <w:rPr>
+          <w:rFonts w:ascii="Microsoft YaHei" w:hAnsi="Microsoft YaHei" w:eastAsia="Microsoft YaHei"/>
+        </w:rPr>
+        <w:t>这项研究关注海洋热浪对生态结构和碳循环的影响。 这类论文主要综合已有观测、理论、模型、外场设计或社区训练材料，而不是发布一个新的单一观测数据集。 研究主要通过综述、模型框架或概念整合来梳理关键过程和不确定性来源。 核心结果帮助说明海洋热浪如何通过强度、持续时间或垂向结构影响生态和碳循环过程。 它有助于解释观测现象、比较方法差异，并为后续海洋生物地球化学分析提供线索。</w:t>
+      </w:r>
+    </w:p>
+    <w:p>
+      <w:r>
+        <w:rPr>
+          <w:rFonts w:ascii="Microsoft YaHei" w:hAnsi="Microsoft YaHei" w:eastAsia="Microsoft YaHei"/>
+          <w:color w:val="0563C1"/>
+          <w:sz w:val="18"/>
+        </w:rPr>
+        <w:t>链接：https://doi.org/10.1088/2515-7620/ae78b5</w:t>
+      </w:r>
+    </w:p>
+    <w:p>
+      <w:pPr>
+        <w:pStyle w:val="Heading3"/>
+      </w:pPr>
+      <w:r>
+        <w:rPr>
+          <w:rFonts w:ascii="Microsoft YaHei" w:hAnsi="Microsoft YaHei" w:eastAsia="Microsoft YaHei"/>
+          <w:b/>
+        </w:rPr>
+        <w:t>13. Evaluation of Trophic State in the Banda Sea Utilizing Marine Biogeochemistry Parameters and Phytoplankton Diversity</w:t>
+      </w:r>
+    </w:p>
+    <w:p>
+      <w:r>
+        <w:rPr>
+          <w:rFonts w:ascii="Microsoft YaHei" w:hAnsi="Microsoft YaHei" w:eastAsia="Microsoft YaHei"/>
+          <w:color w:val="55697D"/>
+          <w:sz w:val="18"/>
+        </w:rPr>
+        <w:t>作者：Iis Triyulianti; Faisal Hamzah; Dessy Berlianty; Bayu Priyono; Teguh Agustiadi; Rikha Widiaratih; Marsya J. Rugebregt; Irma Kesaulya; et al.</w:t>
+      </w:r>
+    </w:p>
+    <w:p>
+      <w:r>
+        <w:rPr>
+          <w:rFonts w:ascii="Microsoft YaHei" w:hAnsi="Microsoft YaHei" w:eastAsia="Microsoft YaHei"/>
+          <w:color w:val="55697D"/>
+          <w:sz w:val="18"/>
+        </w:rPr>
+        <w:t>期刊：IOP Conference Series: Earth and Environmental Science</w:t>
+      </w:r>
+    </w:p>
+    <w:p>
+      <w:r>
+        <w:rPr>
+          <w:rFonts w:ascii="Microsoft YaHei" w:hAnsi="Microsoft YaHei" w:eastAsia="Microsoft YaHei"/>
+          <w:color w:val="55697D"/>
+          <w:sz w:val="18"/>
+        </w:rPr>
+        <w:t>发表月份：2026-05</w:t>
+      </w:r>
+    </w:p>
+    <w:p>
+      <w:r>
+        <w:rPr>
+          <w:rFonts w:ascii="Microsoft YaHei" w:hAnsi="Microsoft YaHei" w:eastAsia="Microsoft YaHei"/>
+          <w:color w:val="55697D"/>
+          <w:sz w:val="18"/>
+        </w:rPr>
+        <w:t>DOI：10.1088/1755-1315/1624/1/012006</w:t>
+      </w:r>
+    </w:p>
+    <w:p>
+      <w:r>
+        <w:rPr>
+          <w:rFonts w:ascii="Microsoft YaHei" w:hAnsi="Microsoft YaHei" w:eastAsia="Microsoft YaHei"/>
+          <w:b/>
+          <w:sz w:val="19"/>
+        </w:rPr>
+        <w:t>关键词：phytoplankton</w:t>
+      </w:r>
+    </w:p>
+    <w:p>
+      <w:r>
+        <w:rPr>
+          <w:rFonts w:ascii="Microsoft YaHei" w:hAnsi="Microsoft YaHei" w:eastAsia="Microsoft YaHei"/>
+        </w:rPr>
+        <w:t>这项研究关注浮游植物群落、生理状态和生产力变化。 研究结合观测、模型或实验结果来刻画海洋生态和生物地球化学过程。 研究主要分析变化趋势、事件响应、驱动机制或方法表现，并把观测结果与生态和生物地球化学过程联系起来。 核心结果或实现为该主题提供了新的观测约束、方法基准或过程解释。 它有助于解释观测现象、比较方法差异，并为后续海洋生物地球化学分析提供线索。</w:t>
+      </w:r>
+    </w:p>
+    <w:p>
+      <w:r>
+        <w:rPr>
+          <w:rFonts w:ascii="Microsoft YaHei" w:hAnsi="Microsoft YaHei" w:eastAsia="Microsoft YaHei"/>
+          <w:color w:val="0563C1"/>
+          <w:sz w:val="18"/>
+        </w:rPr>
+        <w:t>链接：https://doi.org/10.1088/1755-1315/1624/1/012006</w:t>
+      </w:r>
+    </w:p>
+    <w:p>
+      <w:pPr>
+        <w:pStyle w:val="Heading3"/>
+      </w:pPr>
+      <w:r>
+        <w:rPr>
+          <w:rFonts w:ascii="Microsoft YaHei" w:hAnsi="Microsoft YaHei" w:eastAsia="Microsoft YaHei"/>
+          <w:b/>
+        </w:rPr>
+        <w:t>14. Variability of chlorophyll-a in the central part of the eastern Arabian Sea using biogeochemical Argo observations</w:t>
+      </w:r>
+    </w:p>
+    <w:p>
+      <w:r>
+        <w:rPr>
+          <w:rFonts w:ascii="Microsoft YaHei" w:hAnsi="Microsoft YaHei" w:eastAsia="Microsoft YaHei"/>
+          <w:color w:val="55697D"/>
+          <w:sz w:val="18"/>
+        </w:rPr>
+        <w:t>作者：Madhurima Paul; Rashmi R. Nayak; Arun Chakraborty</w:t>
+      </w:r>
+    </w:p>
+    <w:p>
+      <w:r>
+        <w:rPr>
+          <w:rFonts w:ascii="Microsoft YaHei" w:hAnsi="Microsoft YaHei" w:eastAsia="Microsoft YaHei"/>
+          <w:color w:val="55697D"/>
+          <w:sz w:val="18"/>
+        </w:rPr>
+        <w:t>期刊：Discover Oceans</w:t>
+      </w:r>
+    </w:p>
+    <w:p>
+      <w:r>
+        <w:rPr>
+          <w:rFonts w:ascii="Microsoft YaHei" w:hAnsi="Microsoft YaHei" w:eastAsia="Microsoft YaHei"/>
+          <w:color w:val="55697D"/>
+          <w:sz w:val="18"/>
+        </w:rPr>
+        <w:t>发表月份：2026-03</w:t>
+      </w:r>
+    </w:p>
+    <w:p>
+      <w:r>
+        <w:rPr>
+          <w:rFonts w:ascii="Microsoft YaHei" w:hAnsi="Microsoft YaHei" w:eastAsia="Microsoft YaHei"/>
+          <w:color w:val="55697D"/>
+          <w:sz w:val="18"/>
+        </w:rPr>
+        <w:t>DOI：10.1007/s44289-026-00128-2</w:t>
+      </w:r>
+    </w:p>
+    <w:p>
+      <w:r>
+        <w:rPr>
+          <w:rFonts w:ascii="Microsoft YaHei" w:hAnsi="Microsoft YaHei" w:eastAsia="Microsoft YaHei"/>
+          <w:b/>
+          <w:sz w:val="19"/>
+        </w:rPr>
+        <w:t>关键词：BGC-Argo; phytoplankton</w:t>
+      </w:r>
+    </w:p>
+    <w:p>
+      <w:r>
+        <w:rPr>
+          <w:rFonts w:ascii="Microsoft YaHei" w:hAnsi="Microsoft YaHei" w:eastAsia="Microsoft YaHei"/>
+        </w:rPr>
+        <w:t>这项研究关注BGC-Argo 剖面约束的生物地球化学变化。 数据基础是 BGC-Argo 浮标剖面及相关生物地球化学观测，可用于连接垂向结构和过程变化。 研究主要分析变化趋势、事件响应、驱动机制或方法表现，并把观测结果与生态和生物地球化学过程联系起来。 核心结果或实现为该主题提供了新的观测约束、方法基准或过程解释。 它有助于解释观测现象、比较方法差异，并为后续海洋生物地球化学分析提供线索。</w:t>
+      </w:r>
+    </w:p>
+    <w:p>
+      <w:r>
+        <w:rPr>
+          <w:rFonts w:ascii="Microsoft YaHei" w:hAnsi="Microsoft YaHei" w:eastAsia="Microsoft YaHei"/>
+          <w:color w:val="0563C1"/>
+          <w:sz w:val="18"/>
+        </w:rPr>
+        <w:t>链接：https://doi.org/10.1007/s44289-026-00128-2</w:t>
+      </w:r>
+    </w:p>
+    <w:p>
+      <w:pPr>
+        <w:pStyle w:val="Heading3"/>
+      </w:pPr>
+      <w:r>
+        <w:rPr>
+          <w:rFonts w:ascii="Microsoft YaHei" w:hAnsi="Microsoft YaHei" w:eastAsia="Microsoft YaHei"/>
+          <w:b/>
+        </w:rPr>
+        <w:t>15. Annual net community production in the western North Pacific subtropical gyre estimated from Argo float observations</w:t>
+      </w:r>
+    </w:p>
+    <w:p>
+      <w:r>
+        <w:rPr>
+          <w:rFonts w:ascii="Microsoft YaHei" w:hAnsi="Microsoft YaHei" w:eastAsia="Microsoft YaHei"/>
+          <w:color w:val="55697D"/>
+          <w:sz w:val="18"/>
+        </w:rPr>
+        <w:t>作者：Doshik Hahm; Inhee Lee</w:t>
+      </w:r>
+    </w:p>
+    <w:p>
+      <w:r>
+        <w:rPr>
+          <w:rFonts w:ascii="Microsoft YaHei" w:hAnsi="Microsoft YaHei" w:eastAsia="Microsoft YaHei"/>
+          <w:color w:val="55697D"/>
+          <w:sz w:val="18"/>
+        </w:rPr>
+        <w:t>期刊：Ocean Science Journal</w:t>
+      </w:r>
+    </w:p>
+    <w:p>
+      <w:r>
+        <w:rPr>
+          <w:rFonts w:ascii="Microsoft YaHei" w:hAnsi="Microsoft YaHei" w:eastAsia="Microsoft YaHei"/>
+          <w:color w:val="55697D"/>
+          <w:sz w:val="18"/>
+        </w:rPr>
+        <w:t>发表月份：2026-06</w:t>
+      </w:r>
+    </w:p>
+    <w:p>
+      <w:r>
+        <w:rPr>
+          <w:rFonts w:ascii="Microsoft YaHei" w:hAnsi="Microsoft YaHei" w:eastAsia="Microsoft YaHei"/>
+          <w:color w:val="55697D"/>
+          <w:sz w:val="18"/>
+        </w:rPr>
+        <w:t>DOI：10.1007/s12601-026-00277-7</w:t>
+      </w:r>
+    </w:p>
+    <w:p>
+      <w:r>
+        <w:rPr>
+          <w:rFonts w:ascii="Microsoft YaHei" w:hAnsi="Microsoft YaHei" w:eastAsia="Microsoft YaHei"/>
+          <w:b/>
+          <w:sz w:val="19"/>
+        </w:rPr>
+        <w:t>关键词：BGC-Argo; carbon pump</w:t>
+      </w:r>
+    </w:p>
+    <w:p>
+      <w:r>
+        <w:rPr>
+          <w:rFonts w:ascii="Microsoft YaHei" w:hAnsi="Microsoft YaHei" w:eastAsia="Microsoft YaHei"/>
+        </w:rPr>
+        <w:t>这项研究关注BGC-Argo 剖面约束的生物地球化学变化。 数据基础是 BGC-Argo 浮标剖面及相关生物地球化学观测，可用于连接垂向结构和过程变化。 研究主要分析变化趋势、事件响应、驱动机制或方法表现，并把观测结果与生态和生物地球化学过程联系起来。 核心结果或实现为该主题提供了新的观测约束、方法基准或过程解释。 它有助于解释观测现象、比较方法差异，并为后续海洋生物地球化学分析提供线索。</w:t>
+      </w:r>
+    </w:p>
+    <w:p>
+      <w:r>
+        <w:rPr>
+          <w:rFonts w:ascii="Microsoft YaHei" w:hAnsi="Microsoft YaHei" w:eastAsia="Microsoft YaHei"/>
+          <w:color w:val="0563C1"/>
+          <w:sz w:val="18"/>
+        </w:rPr>
+        <w:t>链接：https://doi.org/10.1007/s12601-026-00277-7</w:t>
+      </w:r>
+    </w:p>
+    <w:p>
+      <w:pPr>
+        <w:pStyle w:val="Heading3"/>
+      </w:pPr>
+      <w:r>
+        <w:rPr>
+          <w:rFonts w:ascii="Microsoft YaHei" w:hAnsi="Microsoft YaHei" w:eastAsia="Microsoft YaHei"/>
+          <w:b/>
+        </w:rPr>
+        <w:t>16. Phytoplankton Community in Blue Carbon Ecosystem: Responses to Colour-Producing Agents and Nutrients Variability in Kota Belud, North Borneo, Malaysia</w:t>
+      </w:r>
+    </w:p>
+    <w:p>
+      <w:r>
+        <w:rPr>
+          <w:rFonts w:ascii="Microsoft YaHei" w:hAnsi="Microsoft YaHei" w:eastAsia="Microsoft YaHei"/>
+          <w:color w:val="55697D"/>
+          <w:sz w:val="18"/>
+        </w:rPr>
+        <w:t>作者：Nur Natasha Abd Manap; Madihah Jafar Sidik; Muhammad Ikhlas Zabidi; Noramira Mahadir; B Mabel Manjaji Matsumoto; Ejria Saleh; Muhammad Ali Syed Hussein; Mohd Fikri Mohd Akmal Khodzori; et al.</w:t>
+      </w:r>
+    </w:p>
+    <w:p>
+      <w:r>
+        <w:rPr>
+          <w:rFonts w:ascii="Microsoft YaHei" w:hAnsi="Microsoft YaHei" w:eastAsia="Microsoft YaHei"/>
+          <w:color w:val="55697D"/>
+          <w:sz w:val="18"/>
+        </w:rPr>
+        <w:t>期刊：IOP Conference Series: Earth and Environmental Science</w:t>
+      </w:r>
+    </w:p>
+    <w:p>
+      <w:r>
+        <w:rPr>
+          <w:rFonts w:ascii="Microsoft YaHei" w:hAnsi="Microsoft YaHei" w:eastAsia="Microsoft YaHei"/>
+          <w:color w:val="55697D"/>
+          <w:sz w:val="18"/>
+        </w:rPr>
+        <w:t>发表月份：2026-05</w:t>
+      </w:r>
+    </w:p>
+    <w:p>
+      <w:r>
+        <w:rPr>
+          <w:rFonts w:ascii="Microsoft YaHei" w:hAnsi="Microsoft YaHei" w:eastAsia="Microsoft YaHei"/>
+          <w:color w:val="55697D"/>
+          <w:sz w:val="18"/>
+        </w:rPr>
+        <w:t>DOI：10.1088/1755-1315/1624/1/012002</w:t>
+      </w:r>
+    </w:p>
+    <w:p>
+      <w:r>
+        <w:rPr>
+          <w:rFonts w:ascii="Microsoft YaHei" w:hAnsi="Microsoft YaHei" w:eastAsia="Microsoft YaHei"/>
+          <w:b/>
+          <w:sz w:val="19"/>
+        </w:rPr>
+        <w:t>关键词：phytoplankton; bio-optics</w:t>
+      </w:r>
+    </w:p>
+    <w:p>
+      <w:r>
+        <w:rPr>
+          <w:rFonts w:ascii="Microsoft YaHei" w:hAnsi="Microsoft YaHei" w:eastAsia="Microsoft YaHei"/>
+        </w:rPr>
+        <w:t>这项研究关注海洋生物光学和海洋光学参数、方法与应用。 数据或方法上围绕沉积物捕获器、原位光学、生物光学参数或光谱观测展开。 研究主要分析变化趋势、事件响应、驱动机制或方法表现，并把观测结果与生态和生物地球化学过程联系起来。 核心结果或实现为该主题提供了新的观测约束、方法基准或过程解释。 它有助于解释观测现象、比较方法差异，并为后续海洋生物地球化学分析提供线索。</w:t>
+      </w:r>
+    </w:p>
+    <w:p>
+      <w:r>
+        <w:rPr>
+          <w:rFonts w:ascii="Microsoft YaHei" w:hAnsi="Microsoft YaHei" w:eastAsia="Microsoft YaHei"/>
+          <w:color w:val="0563C1"/>
+          <w:sz w:val="18"/>
+        </w:rPr>
+        <w:t>链接：https://doi.org/10.1088/1755-1315/1624/1/012002</w:t>
       </w:r>
     </w:p>
     <w:sectPr>

</xml_diff>